<commit_message>
fix(diseño-patrones): coherencia del caso, pesos de la Guía y rótulos del PDF
Co-Authored-By: Claude Opus 5.5 <noreply@anthropic.com>
</commit_message>
<xml_diff>
--- a/2026-B/disenio-patrones-arquitectonicos/abp/pdf/Guia-ABP.docx
+++ b/2026-B/disenio-patrones-arquitectonicos/abp/pdf/Guia-ABP.docx
@@ -2770,7 +2770,7 @@
           <w:sz w:val="21"/>
           <w:szCs w:val="21"/>
         </w:rPr>
-        <w:t xml:space="preserve">Consejo:</w:t>
+        <w:t xml:space="preserve">Tip:</w:t>
       </w:r>
       <w:r>
         <w:rPr>
@@ -2919,7 +2919,7 @@
           <w:sz w:val="21"/>
           <w:szCs w:val="21"/>
         </w:rPr>
-        <w:t xml:space="preserve">Atención:</w:t>
+        <w:t xml:space="preserve">Cuidado:</w:t>
       </w:r>
       <w:r>
         <w:rPr>
@@ -6430,7 +6430,7 @@
           <w:sz w:val="22"/>
           <w:szCs w:val="22"/>
         </w:rPr>
-        <w:t xml:space="preserve">Los </w:t>
+        <w:t xml:space="preserve">Los pesos son los que </w:t>
       </w:r>
       <w:r>
         <w:rPr>
@@ -6440,7 +6440,7 @@
           <w:sz w:val="22"/>
           <w:szCs w:val="22"/>
         </w:rPr>
-        <w:t xml:space="preserve">pesos son los del aula</w:t>
+        <w:t xml:space="preserve">declaran los enunciados</w:t>
       </w:r>
       <w:r>
         <w:rPr>
@@ -6449,7 +6449,7 @@
           <w:sz w:val="22"/>
           <w:szCs w:val="22"/>
         </w:rPr>
-        <w:t xml:space="preserve"> (20 % · 20 % · 20 % · 40 %); aquí no se crea ninguna nota nueva. La tabla dice qué evidencia del proyecto responde a cada criterio de los enunciados.</w:t>
+        <w:t xml:space="preserve"> de las actividades (20 % · 20 % · 20 % · 40 %); aquí no se crea ninguna nota nueva. La tabla dice qué evidencia del proyecto responde a cada criterio de los enunciados.</w:t>
       </w:r>
     </w:p>
     <w:p>
@@ -7809,7 +7809,7 @@
           <w:sz w:val="21"/>
           <w:szCs w:val="21"/>
         </w:rPr>
-        <w:t xml:space="preserve">Atención:</w:t>
+        <w:t xml:space="preserve">Cuidado:</w:t>
       </w:r>
       <w:r>
         <w:rPr>
@@ -7859,7 +7859,7 @@
           <w:sz w:val="21"/>
           <w:szCs w:val="21"/>
         </w:rPr>
-        <w:t xml:space="preserve">Atención:</w:t>
+        <w:t xml:space="preserve">Cuidado:</w:t>
       </w:r>
       <w:r>
         <w:rPr>
@@ -7928,7 +7928,7 @@
           <w:sz w:val="21"/>
           <w:szCs w:val="21"/>
         </w:rPr>
-        <w:t xml:space="preserve">Atención:</w:t>
+        <w:t xml:space="preserve">Cuidado:</w:t>
       </w:r>
       <w:r>
         <w:rPr>
@@ -7997,7 +7997,7 @@
           <w:sz w:val="21"/>
           <w:szCs w:val="21"/>
         </w:rPr>
-        <w:t xml:space="preserve">Atención:</w:t>
+        <w:t xml:space="preserve">Cuidado:</w:t>
       </w:r>
       <w:r>
         <w:rPr>

</xml_diff>